<commit_message>
Refund pot: 20% of every payment waits in the Stripe balance until its refund window closes — 45 days monthly/one-time, 193 days annual (6 months + new 10-day grace period on the annual half-refund) — with only the remaining 80% split to NREUV immediately; the daily cron releases matured slices at the same rate, refund-eligible cancellations consume the slice instead, and the REFUND DUE alert now does the exact dollar math (refund, pot coverage, remaining reversal); held_transfers table; grace period reflected in Terms, member billing card, emails and the pricing docs
Co-Authored-By: Claude Fable 5 <noreply@anthropic.com>
</commit_message>
<xml_diff>
--- a/PRICING-RULES.docx
+++ b/PRICING-RULES.docx
@@ -593,7 +593,7 @@
         <w:rPr>
           <w:color w:val="161616"/>
         </w:rPr>
-        <w:t xml:space="preserve">cancel at or before the 6-month mark → half the annual payment (6 months) refunded. After 6 months → no refund; access runs to the end of the paid year.</w:t>
+        <w:t xml:space="preserve">cancel within the first 6 months — plus a 10-day grace period past the mark → half the annual payment (6 months) refunded. More than 10 days into the second half → refund forfeited; access runs to the end of the paid year.</w:t>
       </w:r>
     </w:p>
     <w:p>
@@ -1872,7 +1872,7 @@
         <w:rPr>
           <w:color w:val="161616"/>
         </w:rPr>
-        <w:t xml:space="preserve">cancel at or before the 6-month mark → 6 months (half) refunded; after → no refund, access runs to year end.</w:t>
+        <w:t xml:space="preserve">cancel within the first 6 months (10-day grace period honored) → 6 months (half) refunded; more than 10 days into the second half → refund forfeited, access runs to year end.</w:t>
       </w:r>
     </w:p>
     <w:p>
@@ -1918,7 +1918,44 @@
           <w:bCs/>
           <w:color w:val="B80101"/>
         </w:rPr>
-        <w:t xml:space="preserve">12. Revenue splits (NREUV share of GROSS; platform absorbs Stripe fees, capped at net)</w:t>
+        <w:t xml:space="preserve">12. Revenue splits &amp; the refund pot</w:t>
+      </w:r>
+    </w:p>
+    <w:p>
+      <w:pPr>
+        <w:pStyle w:val="ListParagraph"/>
+        <w:numPr>
+          <w:ilvl w:val="0"/>
+          <w:numId w:val="2"/>
+        </w:numPr>
+        <w:spacing w:after="60"/>
+      </w:pPr>
+      <w:r>
+        <w:rPr>
+          <w:b/>
+          <w:bCs/>
+          <w:color w:val="161616"/>
+        </w:rPr>
+        <w:t xml:space="preserve">The refund pot: </w:t>
+      </w:r>
+      <w:r>
+        <w:rPr>
+          <w:color w:val="161616"/>
+        </w:rPr>
+        <w:t xml:space="preserve">20% of every payment stays in the Stripe platform balance until its refund window closes — 45 days for monthly/one-time, 193 days (6 months + the 10-day grace) for annual. Only the remaining 80% is split immediately. The daily cron releases each slice on schedule at the same rate; a refund-eligible cancellation consumes the slice to fund the refund instead, and the REFUND DUE alert states the exact amounts to refund, what the pot covers, and what remains to reverse.</w:t>
+      </w:r>
+    </w:p>
+    <w:p>
+      <w:pPr>
+        <w:spacing w:after="120"/>
+      </w:pPr>
+      <w:r>
+        <w:rPr>
+          <w:b/>
+          <w:bCs/>
+          <w:color w:val="161616"/>
+        </w:rPr>
+        <w:t xml:space="preserve">NREUV share of GROSS; platform absorbs Stripe fees, capped at net:</w:t>
       </w:r>
     </w:p>
     <w:tbl>

</xml_diff>

<commit_message>
New prices Builder $149.99 / Premium $249.99 swept everywhere incl annual amounts and revenue stats; Underwriting Series loaded as two hidden draft courses (mc8 six modules, mc9 four modules) with VERIFY items preserved for the team; courses gain a hidden flag with Publish/Unpublish buttons in the admin Courses tab — drafts invisible to members and search; all five plan cards forced into one row; Builder price added to the signup picker
Co-Authored-By: Claude Fable 5 <noreply@anthropic.com>
</commit_message>
<xml_diff>
--- a/PRICING-RULES.docx
+++ b/PRICING-RULES.docx
@@ -270,7 +270,7 @@
                 <w:sz w:val="20"/>
                 <w:szCs w:val="20"/>
               </w:rPr>
-              <w:t xml:space="preserve">$99.99/mo</w:t>
+              <w:t xml:space="preserve">$149.99/mo</w:t>
             </w:r>
           </w:p>
         </w:tc>
@@ -341,7 +341,7 @@
                 <w:sz w:val="20"/>
                 <w:szCs w:val="20"/>
               </w:rPr>
-              <w:t xml:space="preserve">$149.99/mo</w:t>
+              <w:t xml:space="preserve">$249.99/mo</w:t>
             </w:r>
           </w:p>
         </w:tc>
@@ -569,7 +569,7 @@
         <w:rPr>
           <w:color w:val="161616"/>
         </w:rPr>
-        <w:t xml:space="preserve">12 × the monthly rate with a 10% discount (ANNUAL10) applied visibly at checkout, every year. Effective: Member $539.89 · Builder $1,079.89 · Premium $1,619.89 · Elite $5,399.89.</w:t>
+        <w:t xml:space="preserve">12 × the monthly rate with a 10% discount (ANNUAL10) applied visibly at checkout, every year. Effective: Member $539.89 · Builder $1,619.89 · Premium $2,699.89 · Elite $5,399.89.</w:t>
       </w:r>
     </w:p>
     <w:p>

</xml_diff>

<commit_message>
Builder members get free live Lunch & Learns: RSVP access alongside Premium and Elite (recordings they already had), shown on the Builder plan card; pricing docs updated
Co-Authored-By: Claude Fable 5 <noreply@anthropic.com>
</commit_message>
<xml_diff>
--- a/PRICING-RULES.docx
+++ b/PRICING-RULES.docx
@@ -293,7 +293,7 @@
                 <w:sz w:val="20"/>
                 <w:szCs w:val="20"/>
               </w:rPr>
-              <w:t xml:space="preserve">Posting, L&amp;L recordings, view-only templates</w:t>
+              <w:t xml:space="preserve">Posting, free live L&amp;Ls + recordings, view-only templates</w:t>
             </w:r>
           </w:p>
         </w:tc>
@@ -940,7 +940,7 @@
         <w:rPr>
           <w:color w:val="161616"/>
         </w:rPr>
-        <w:t xml:space="preserve">100% of L&amp;L revenue goes to NREUV. Recordings open at Builder+; live access included with Premium and Elite.</w:t>
+        <w:t xml:space="preserve">100% of L&amp;L revenue goes to NREUV. Live sessions and recordings are free for Builder, Premium, and Elite members; Member and Free accounts buy access or use a code.</w:t>
       </w:r>
     </w:p>
     <w:p>

</xml_diff>

<commit_message>
Course passes are read-only: written lessons and lesson videos only — worksheet, template and case-study PDF downloads are stripped server-side for pass/trial holders and stay a membership benefit; pass cards and pricing docs say so
Co-Authored-By: Claude Fable 5 <noreply@anthropic.com>
</commit_message>
<xml_diff>
--- a/PRICING-RULES.docx
+++ b/PRICING-RULES.docx
@@ -767,7 +767,7 @@
                 <w:sz w:val="20"/>
                 <w:szCs w:val="20"/>
               </w:rPr>
-              <w:t xml:space="preserve">60 days of one course</w:t>
+              <w:t xml:space="preserve">60 days of one course — written lessons only</w:t>
             </w:r>
           </w:p>
         </w:tc>
@@ -838,7 +838,7 @@
                 <w:sz w:val="20"/>
                 <w:szCs w:val="20"/>
               </w:rPr>
-              <w:t xml:space="preserve">30 days of every course</w:t>
+              <w:t xml:space="preserve">30 days of every course — written lessons only</w:t>
             </w:r>
           </w:p>
         </w:tc>
@@ -848,6 +848,30 @@
       <w:pPr>
         <w:spacing w:after="100"/>
       </w:pPr>
+    </w:p>
+    <w:p>
+      <w:pPr>
+        <w:pStyle w:val="ListParagraph"/>
+        <w:numPr>
+          <w:ilvl w:val="0"/>
+          <w:numId w:val="2"/>
+        </w:numPr>
+        <w:spacing w:after="60"/>
+      </w:pPr>
+      <w:r>
+        <w:rPr>
+          <w:b/>
+          <w:bCs/>
+          <w:color w:val="161616"/>
+        </w:rPr>
+        <w:t xml:space="preserve">Passes are read-only: </w:t>
+      </w:r>
+      <w:r>
+        <w:rPr>
+          <w:color w:val="161616"/>
+        </w:rPr>
+        <w:t xml:space="preserve">written lessons and lesson videos only — worksheet/template/case-study PDF downloads are a membership benefit, enforced server-side.</w:t>
+      </w:r>
     </w:p>
     <w:p>
       <w:pPr>

</xml_diff>

<commit_message>
Partner tier reframed as cohort subscriptions at group discounts instead of cohort licensing, on the banner and in the pricing docs
Co-Authored-By: Claude Fable 5 <noreply@anthropic.com>
</commit_message>
<xml_diff>
--- a/PRICING-RULES.docx
+++ b/PRICING-RULES.docx
@@ -2204,7 +2204,37 @@
           <w:bCs/>
           <w:color w:val="B80101"/>
         </w:rPr>
-        <w:t xml:space="preserve">13. Comped accounts</w:t>
+        <w:t xml:space="preserve">13. Partner tier (organizations)</w:t>
+      </w:r>
+    </w:p>
+    <w:p>
+      <w:pPr>
+        <w:pStyle w:val="ListParagraph"/>
+        <w:numPr>
+          <w:ilvl w:val="0"/>
+          <w:numId w:val="2"/>
+        </w:numPr>
+        <w:spacing w:after="60"/>
+      </w:pPr>
+      <w:r>
+        <w:rPr>
+          <w:color w:val="161616"/>
+        </w:rPr>
+        <w:t xml:space="preserve">Contact-us tier for agencies, CDFIs &amp; nonprofit developer programs: cohort subscriptions at group discounts (multiple seats), custom curriculum scope, dedicated onboarding. Routed through the contact page.</w:t>
+      </w:r>
+    </w:p>
+    <w:p>
+      <w:pPr>
+        <w:pStyle w:val="Heading1"/>
+        <w:spacing w:after="120" w:before="300"/>
+      </w:pPr>
+      <w:r>
+        <w:rPr>
+          <w:b/>
+          <w:bCs/>
+          <w:color w:val="B80101"/>
+        </w:rPr>
+        <w:t xml:space="preserve">14. Comped accounts</w:t>
       </w:r>
     </w:p>
     <w:p>

</xml_diff>

<commit_message>
Waitlist budget question gains 'I need specific, customized deal help' — full-width option that assigns an Elite recommendation with an inline note pointing at Elite or the retainer; server algorithm, admin mirror, MRR stats and pricing docs all updated
Co-Authored-By: Claude Fable 5 <noreply@anthropic.com>
</commit_message>
<xml_diff>
--- a/PRICING-RULES.docx
+++ b/PRICING-RULES.docx
@@ -1685,6 +1685,30 @@
           <w:color w:val="161616"/>
         </w:rPr>
         <w:t xml:space="preserve"> — only Elite and the retainer include deal support.</w:t>
+      </w:r>
+    </w:p>
+    <w:p>
+      <w:pPr>
+        <w:pStyle w:val="ListParagraph"/>
+        <w:numPr>
+          <w:ilvl w:val="0"/>
+          <w:numId w:val="2"/>
+        </w:numPr>
+        <w:spacing w:after="60"/>
+      </w:pPr>
+      <w:r>
+        <w:rPr>
+          <w:b/>
+          <w:bCs/>
+          <w:color w:val="161616"/>
+        </w:rPr>
+        <w:t xml:space="preserve">"I need specific, customized deal help" (budget answer) → Elite</w:t>
+      </w:r>
+      <w:r>
+        <w:rPr>
+          <w:color w:val="161616"/>
+        </w:rPr>
+        <w:t xml:space="preserve"> — the same rule, asked from the budget question.</w:t>
       </w:r>
     </w:p>
     <w:p>

</xml_diff>

<commit_message>
Every paid member gets free live Lunch and Learn invites — Member tier included, RSVP and all — while the recording library stays Builder and up (live-only membership access can't see old sessions); Founding 25 pricing becomes a first-year deal instead of forever, applied as a visible 12-month Stripe coupon (FOUND25B/P, annual once variants) so subscriptions carry the real price and renew at standard rates after year one; waitlist banner, plan cards, member benefits and pricing docs updated
Co-Authored-By: Claude Fable 5 <noreply@anthropic.com>
</commit_message>
<xml_diff>
--- a/PRICING-RULES.docx
+++ b/PRICING-RULES.docx
@@ -964,7 +964,7 @@
         <w:rPr>
           <w:color w:val="161616"/>
         </w:rPr>
-        <w:t xml:space="preserve">100% of L&amp;L revenue goes to NREUV. Live sessions and recordings are free for Builder, Premium, and Elite members; Member and Free accounts buy access or use a code.</w:t>
+        <w:t xml:space="preserve">100% of L&amp;L revenue goes to NREUV. EVERY paid member gets free invites to live sessions (Member and up); the recording library stays Builder and up. Free accounts buy access or use a code (purchase includes recordings).</w:t>
       </w:r>
     </w:p>
     <w:p>
@@ -1612,7 +1612,7 @@
         <w:rPr>
           <w:color w:val="161616"/>
         </w:rPr>
-        <w:t xml:space="preserve">first year of Lunch &amp; Learns free (even on a free account), a Founding badge, and grandfathered pricing forever — Builder at $99.99/mo and Premium at $149.99/mo (pre-increase rates), applied automatically at checkout and locked for every renewal.</w:t>
+        <w:t xml:space="preserve">first year of Lunch &amp; Learns free (even on a free account), a Founding badge, and founding pricing for their FIRST YEAR — Builder at $99.99/mo and Premium at $149.99/mo, applied automatically as a 12-month coupon at checkout, then standard rates.</w:t>
       </w:r>
     </w:p>
     <w:p>

</xml_diff>

<commit_message>
GroundUp Lifetime Pass at $5,000: every course in perpetuity, one free year of Builder that the daily cron winds down without touching paid subscriptions, office hours for the first five years at the Premium allowance, and Lunch & Learns live and recorded for life — ceiling is Builder, nothing above it; gold card in the passes section, welcome and wrap-up emails, docs updated
Co-Authored-By: Claude Fable 5 <noreply@anthropic.com>
</commit_message>
<xml_diff>
--- a/PRICING-RULES.docx
+++ b/PRICING-RULES.docx
@@ -848,6 +848,30 @@
       <w:pPr>
         <w:spacing w:after="100"/>
       </w:pPr>
+    </w:p>
+    <w:p>
+      <w:pPr>
+        <w:pStyle w:val="ListParagraph"/>
+        <w:numPr>
+          <w:ilvl w:val="0"/>
+          <w:numId w:val="2"/>
+        </w:numPr>
+        <w:spacing w:after="60"/>
+      </w:pPr>
+      <w:r>
+        <w:rPr>
+          <w:b/>
+          <w:bCs/>
+          <w:color w:val="161616"/>
+        </w:rPr>
+        <w:t xml:space="preserve">GroundUp Lifetime Pass — $5,000 one-time: </w:t>
+      </w:r>
+      <w:r>
+        <w:rPr>
+          <w:color w:val="161616"/>
+        </w:rPr>
+        <w:t xml:space="preserve">every course in perpetuity (new ones included), one year of Builder free (auto-reverts, never touches paid subs), office hours for the first 5 years at the Premium allowance, and every Lunch &amp; Learn live + recorded for life. Ceiling is Builder — nothing above it.</w:t>
+      </w:r>
     </w:p>
     <w:p>
       <w:pPr>

</xml_diff>